<commit_message>
Inject high-res visual assets and content evaluation report
Co-authored-by: Amogh-1416 <139241924+Amogh-1416@users.noreply.github.com>
</commit_message>
<xml_diff>
--- a/Vayu-Drishti-IEEE (1).docx
+++ b/Vayu-Drishti-IEEE (1).docx
@@ -3138,6 +3138,40 @@
       </w:r>
     </w:p>
     <w:p>
+      <w:r>
+        <w:drawing>
+          <wp:inline>
+            <wp:extent cx="5486400" cy="4338735"/>
+            <wp:docPr id="1" name="Picture 1"/>
+            <wp:cNvGraphicFramePr>
+              <a:graphicFrameLocks noChangeAspect="1"/>
+            </wp:cNvGraphicFramePr>
+            <a:graphic>
+              <a:graphicData uri="http://schemas.openxmlformats.org/drawingml/2006/picture">
+                <pic:pic>
+                  <pic:nvPicPr>
+                    <pic:cNvPr id="0" name="arch.png"/>
+                    <pic:cNvPicPr/>
+                  </pic:nvPicPr>
+                  <pic:blipFill>
+                    <a:blip r:embed="rId7"/>
+                    <a:stretch>
+                      <a:fillRect/>
+                    </a:stretch>
+                  </pic:blipFill>
+                  <pic:spPr>
+                    <a:xfrm>
+                      <a:off x="0" y="0"/>
+                      <a:ext cx="5486400" cy="4338735"/>
+                    </a:xfrm>
+                    <a:prstGeom prst="rect"/>
+                  </pic:spPr>
+                </pic:pic>
+              </a:graphicData>
+            </a:graphic>
+          </wp:inline>
+        </w:drawing>
+      </w:r>
       <w:pPr>
         <w:spacing w:after="115" w:before="40" w:line="240" w:lineRule="auto"/>
         <w:jc w:val="center"/>
@@ -4981,6 +5015,40 @@
       </w:r>
     </w:p>
     <w:p>
+      <w:r>
+        <w:drawing>
+          <wp:inline>
+            <wp:extent cx="5486400" cy="1742492"/>
+            <wp:docPr id="2" name="Picture 2"/>
+            <wp:cNvGraphicFramePr>
+              <a:graphicFrameLocks noChangeAspect="1"/>
+            </wp:cNvGraphicFramePr>
+            <a:graphic>
+              <a:graphicData uri="http://schemas.openxmlformats.org/drawingml/2006/picture">
+                <pic:pic>
+                  <pic:nvPicPr>
+                    <pic:cNvPr id="0" name="ml_pipe.png"/>
+                    <pic:cNvPicPr/>
+                  </pic:nvPicPr>
+                  <pic:blipFill>
+                    <a:blip r:embed="rId8"/>
+                    <a:stretch>
+                      <a:fillRect/>
+                    </a:stretch>
+                  </pic:blipFill>
+                  <pic:spPr>
+                    <a:xfrm>
+                      <a:off x="0" y="0"/>
+                      <a:ext cx="5486400" cy="1742492"/>
+                    </a:xfrm>
+                    <a:prstGeom prst="rect"/>
+                  </pic:spPr>
+                </pic:pic>
+              </a:graphicData>
+            </a:graphic>
+          </wp:inline>
+        </w:drawing>
+      </w:r>
       <w:pPr>
         <w:spacing w:after="115" w:before="40" w:line="240" w:lineRule="auto"/>
         <w:jc w:val="center"/>
@@ -5187,6 +5255,40 @@
       </w:r>
     </w:p>
     <w:p>
+      <w:r>
+        <w:drawing>
+          <wp:inline>
+            <wp:extent cx="5486400" cy="3352022"/>
+            <wp:docPr id="3" name="Picture 3"/>
+            <wp:cNvGraphicFramePr>
+              <a:graphicFrameLocks noChangeAspect="1"/>
+            </wp:cNvGraphicFramePr>
+            <a:graphic>
+              <a:graphicData uri="http://schemas.openxmlformats.org/drawingml/2006/picture">
+                <pic:pic>
+                  <pic:nvPicPr>
+                    <pic:cNvPr id="0" name="ws_flow.png"/>
+                    <pic:cNvPicPr/>
+                  </pic:nvPicPr>
+                  <pic:blipFill>
+                    <a:blip r:embed="rId9"/>
+                    <a:stretch>
+                      <a:fillRect/>
+                    </a:stretch>
+                  </pic:blipFill>
+                  <pic:spPr>
+                    <a:xfrm>
+                      <a:off x="0" y="0"/>
+                      <a:ext cx="5486400" cy="3352022"/>
+                    </a:xfrm>
+                    <a:prstGeom prst="rect"/>
+                  </pic:spPr>
+                </pic:pic>
+              </a:graphicData>
+            </a:graphic>
+          </wp:inline>
+        </w:drawing>
+      </w:r>
       <w:pPr>
         <w:spacing w:after="115" w:before="40" w:line="240" w:lineRule="auto"/>
         <w:jc w:val="left"/>
@@ -5503,6 +5605,40 @@
       </w:r>
     </w:p>
     <w:p>
+      <w:r>
+        <w:drawing>
+          <wp:inline>
+            <wp:extent cx="4114800" cy="2571750"/>
+            <wp:docPr id="4" name="Picture 4"/>
+            <wp:cNvGraphicFramePr>
+              <a:graphicFrameLocks noChangeAspect="1"/>
+            </wp:cNvGraphicFramePr>
+            <a:graphic>
+              <a:graphicData uri="http://schemas.openxmlformats.org/drawingml/2006/picture">
+                <pic:pic>
+                  <pic:nvPicPr>
+                    <pic:cNvPr id="0" name="yolo_loss.png"/>
+                    <pic:cNvPicPr/>
+                  </pic:nvPicPr>
+                  <pic:blipFill>
+                    <a:blip r:embed="rId10"/>
+                    <a:stretch>
+                      <a:fillRect/>
+                    </a:stretch>
+                  </pic:blipFill>
+                  <pic:spPr>
+                    <a:xfrm>
+                      <a:off x="0" y="0"/>
+                      <a:ext cx="4114800" cy="2571750"/>
+                    </a:xfrm>
+                    <a:prstGeom prst="rect"/>
+                  </pic:spPr>
+                </pic:pic>
+              </a:graphicData>
+            </a:graphic>
+          </wp:inline>
+        </w:drawing>
+      </w:r>
       <w:pPr>
         <w:spacing w:after="40" w:before="115" w:line="240" w:lineRule="auto"/>
         <w:jc w:val="left"/>
@@ -5610,6 +5746,40 @@
       </w:r>
     </w:p>
     <w:p>
+      <w:r>
+        <w:drawing>
+          <wp:inline>
+            <wp:extent cx="4114800" cy="2571750"/>
+            <wp:docPr id="5" name="Picture 5"/>
+            <wp:cNvGraphicFramePr>
+              <a:graphicFrameLocks noChangeAspect="1"/>
+            </wp:cNvGraphicFramePr>
+            <a:graphic>
+              <a:graphicData uri="http://schemas.openxmlformats.org/drawingml/2006/picture">
+                <pic:pic>
+                  <pic:nvPicPr>
+                    <pic:cNvPr id="0" name="seg_acc.png"/>
+                    <pic:cNvPicPr/>
+                  </pic:nvPicPr>
+                  <pic:blipFill>
+                    <a:blip r:embed="rId11"/>
+                    <a:stretch>
+                      <a:fillRect/>
+                    </a:stretch>
+                  </pic:blipFill>
+                  <pic:spPr>
+                    <a:xfrm>
+                      <a:off x="0" y="0"/>
+                      <a:ext cx="4114800" cy="2571750"/>
+                    </a:xfrm>
+                    <a:prstGeom prst="rect"/>
+                  </pic:spPr>
+                </pic:pic>
+              </a:graphicData>
+            </a:graphic>
+          </wp:inline>
+        </w:drawing>
+      </w:r>
       <w:pPr>
         <w:spacing w:after="115" w:before="40" w:line="240" w:lineRule="auto"/>
         <w:jc w:val="center"/>

</xml_diff>

<commit_message>
Add A* Routing Engine subsection to research paper
Co-authored-by: Amogh-1416 <139241924+Amogh-1416@users.noreply.github.com>
</commit_message>
<xml_diff>
--- a/Vayu-Drishti-IEEE (1).docx
+++ b/Vayu-Drishti-IEEE (1).docx
@@ -5453,6 +5453,64 @@
         <w:rPr>
           <w:rtl w:val="0"/>
         </w:rPr>
+      </w:r>
+    </w:p>
+    <w:p>
+      <w:pPr>
+        <w:jc w:val="both"/>
+      </w:pPr>
+      <w:r>
+        <w:rPr>
+          <w:rFonts w:ascii="Times New Roman" w:hAnsi="Times New Roman"/>
+          <w:sz w:val="20"/>
+        </w:rPr>
+        <w:t>3) Real-Time Path Computation: When a survivor cluster is detected by YOLOv11n, the A* algorithm is triggered. It computes the shortest, safest route from a designated safe-zone dispatch point to the survivor's coordinates, strictly navigating around the dynamically generated 20-meter hazard buffers. Operating within the asynchronous Django Channels framework, this computation happens in milliseconds. The finalized safe path is serialized as a GeoJSON polyline and broadcasted via Redis Pub/Sub directly to the CesiumJS 3D dashboard, allowing command center operators to guide ground teams precisely and safely in real-time.</w:t>
+      </w:r>
+    </w:p>
+    <w:p>
+      <w:pPr>
+        <w:jc w:val="both"/>
+      </w:pPr>
+      <w:r>
+        <w:rPr>
+          <w:rFonts w:ascii="Times New Roman" w:hAnsi="Times New Roman"/>
+          <w:sz w:val="20"/>
+        </w:rPr>
+        <w:t>2) Dynamic Hazard Buffering: The routing engine, implemented using Python's NetworkX and Shapely libraries, treats these severe damage classifications as impassable zones. To ensure maximum safety for deployed rescue teams, the engine dynamically applies a 20-meter exclusion buffer around all polygons flagged as hazardous. This mathematical inflation prevents the algorithm from computing paths that skirt dangerously close to unstable structures or flooded routes.</w:t>
+      </w:r>
+    </w:p>
+    <w:p>
+      <w:pPr>
+        <w:jc w:val="both"/>
+      </w:pPr>
+      <w:r>
+        <w:rPr>
+          <w:rFonts w:ascii="Times New Roman" w:hAnsi="Times New Roman"/>
+          <w:sz w:val="20"/>
+        </w:rPr>
+        <w:t>1) PostGIS Geometry Integration: As the RescueNet segmentation model classifies areas into distinct damage categories (e.g., 'Building Major Damage', 'Road Blocked'), these semantic masks are vectorized into precise geographic polygons. These polygons are instantaneously persisted into a PostGIS-enabled PostgreSQL database alongside the drone's telemetry.</w:t>
+      </w:r>
+    </w:p>
+    <w:p>
+      <w:pPr>
+        <w:jc w:val="both"/>
+      </w:pPr>
+      <w:r>
+        <w:rPr>
+          <w:rFonts w:ascii="Times New Roman" w:hAnsi="Times New Roman"/>
+          <w:sz w:val="20"/>
+        </w:rPr>
+        <w:t>While YOLOv11n and RescueNet provide vital intelligence regarding survivor locations and infrastructural damage, the true operational value of VAYU-DRISHTI lies in transforming this raw data into actionable ground-level guidance. This is achieved through our highly specialized Django-based routing backend, which utilizes a Grid-Based A* (A-Star) search algorithm.</w:t>
+      </w:r>
+    </w:p>
+    <w:p>
+      <w:r>
+        <w:rPr>
+          <w:rFonts w:ascii="Times New Roman" w:hAnsi="Times New Roman"/>
+          <w:b/>
+          <w:sz w:val="20"/>
+        </w:rPr>
+        <w:t>D. Grid-Based A* Routing Engine and Django Backend</w:t>
       </w:r>
     </w:p>
     <w:p>

</xml_diff>